<commit_message>
Verify template report and freeze offline candidate evidence
</commit_message>
<xml_diff>
--- a/docs/第3组_松鼠备份_实验报告.docx
+++ b/docs/第3组_松鼠备份_实验报告.docx
@@ -4307,7 +4307,7 @@
                 <w:lang w:bidi="ar"/>
               </w:rPr>
               <w:keepNext/>
-              <w:spacing w:before="480"/>
+              <w:spacing w:before="960"/>
               <w:snapToGrid w:val="0"/>
             </w:pPr>
             <w:r>
@@ -12687,7 +12687,7 @@
                 <w:lang w:bidi="ar"/>
               </w:rPr>
               <w:keepNext/>
-              <w:spacing w:before="480"/>
+              <w:spacing w:before="960"/>
               <w:snapToGrid w:val="0"/>
             </w:pPr>
             <w:r>
@@ -12861,6 +12861,7 @@
                 <w:lang w:bidi="ar"/>
               </w:rPr>
               <w:keepNext/>
+              <w:spacing w:before="480"/>
               <w:snapToGrid w:val="0"/>
             </w:pPr>
             <w:r>
@@ -13908,6 +13909,7 @@
         <w:trPr>
           <w:trHeight w:val="2952" w:hRule="atLeast"/>
           <w:jc w:val="center"/>
+          <w:cantSplit/>
         </w:trPr>
         <w:tc>
           <w:tcPr>
@@ -13996,6 +13998,7 @@
                 <w:rFonts w:ascii="Calibri" w:hAnsi="Calibri"/>
                 <w:szCs w:val="22"/>
               </w:rPr>
+              <w:keepLines/>
               <w:widowControl w:val="1"/>
               <w:snapToGrid w:val="0"/>
             </w:pPr>
@@ -14285,6 +14288,7 @@
                 <w:lang w:bidi="ar"/>
               </w:rPr>
               <w:keepNext/>
+              <w:spacing w:before="480"/>
               <w:snapToGrid w:val="0"/>
             </w:pPr>
             <w:r>
@@ -14325,6 +14329,7 @@
         <w:trPr>
           <w:trHeight w:val="2959" w:hRule="atLeast"/>
           <w:jc w:val="center"/>
+          <w:cantSplit/>
         </w:trPr>
         <w:tc>
           <w:tcPr>

</xml_diff>

<commit_message>
Bind reviewed report to its inputs and use the current Mac for acceptance
</commit_message>
<xml_diff>
--- a/docs/第3组_松鼠备份_实验报告.docx
+++ b/docs/第3组_松鼠备份_实验报告.docx
@@ -603,7 +603,7 @@
                 <w:lang w:val="en-US" w:eastAsia="zh-CN"/>
                 <w:color w:val="000000"/>
               </w:rPr>
-              <w:t xml:space="preserve">一、实验室名称：________________（按实际填写）</w:t>
+              <w:t xml:space="preserve">一、实验室名称：自主实验环境（macOS个人计算机）</w:t>
             </w:r>
           </w:p>
         </w:tc>
@@ -9106,7 +9106,7 @@
                 <w:szCs w:val="22"/>
                 <w:color w:val="000000"/>
               </w:rPr>
-              <w:t xml:space="preserve">版本 0.2.0。整理时间 2026年10月29日 12:46（北京时间）。本轮命名测试 97 项，通过 97 项。结果来自可复现的测试程序及其 XML、JSON 和日志。GUI 内部断言与核心用例分开统计；未完成的长期测试不写成通过。</w:t>
+              <w:t xml:space="preserve">版本 0.2.0。整理时间 2026年10月29日 16:52（北京时间）。本轮命名测试 97 项，通过 97 项。结果来自可复现的测试程序及其 XML、JSON 和日志。GUI 内部断言与核心用例分开统计；未完成的长期测试不写成通过。</w:t>
             </w:r>
           </w:p>
           <w:p>
@@ -9174,7 +9174,7 @@
                 <w:szCs w:val="22"/>
                 <w:color w:val="000000"/>
               </w:rPr>
-              <w:t xml:space="preserve">所有源目录、备份与恢复目标都在测试临时目录内。普通文件用完整字节或SHA256比较；链接用目标字符串和inode关系检查；FIFO只检查类型；元数据按权限、时间和扩展属性逐项比对。报告中的执行结果由本次编程会话自动取得，学生复核签名另行填写。</w:t>
+              <w:t xml:space="preserve">所有源目录、备份与恢复目标都在测试临时目录内。普通文件用完整字节或SHA256比较；链接用目标字符串和inode关系检查；FIFO只检查类型；元数据按权限、时间和扩展属性逐项比对。测试由随包脚本执行，用例名称和原始输出一并保留。</w:t>
             </w:r>
           </w:p>
           <w:tbl>
@@ -12979,6 +12979,26 @@
           </w:p>
           <w:p>
             <w:pPr>
+              <w:spacing w:line="360" w:lineRule="auto"/>
+              <w:ind w:firstLine="420" w:firstLineChars="200"/>
+              <w:rPr>
+                <w:rFonts w:ascii="Calibri" w:hAnsi="Calibri"/>
+                <w:szCs w:val="22"/>
+              </w:rPr>
+              <w:widowControl w:val="1"/>
+              <w:snapToGrid w:val="0"/>
+            </w:pPr>
+            <w:r>
+              <w:rPr>
+                <w:rFonts w:hint="eastAsia" w:ascii="Calibri" w:hAnsi="Calibri"/>
+                <w:szCs w:val="22"/>
+                <w:color w:val="000000"/>
+              </w:rPr>
+              <w:t xml:space="preserve">归档解析器使用LLVM libFuzzer 14.0.6进行覆盖率引导测试，运行602.286秒、119,844次，通过。进程正常退出，没有崩溃工件或ASan/UBSan错误标记。归档与Huffman相关源码哈希与本次源码一致。测试使用空恢复目标，范围为SQTREE解析与Huffman解码，不含文件写入、加密封装和GUI。执行次数不并入97项用例，也不代表覆盖百分比。复现方法见test-results/archive-fuzz-020.md，原始JSON和日志同名保存。</w:t>
+            </w:r>
+          </w:p>
+          <w:p>
+            <w:pPr>
               <w:widowControl w:val="1"/>
               <w:jc w:val="left"/>
               <w:rPr>
@@ -12990,6 +13010,7 @@
                 <w:lang w:bidi="ar"/>
               </w:rPr>
               <w:keepNext/>
+              <w:spacing w:before="400"/>
               <w:snapToGrid w:val="0"/>
             </w:pPr>
             <w:r>
@@ -13709,6 +13730,26 @@
           </w:p>
           <w:p>
             <w:pPr>
+              <w:spacing w:line="360" w:lineRule="auto"/>
+              <w:ind w:firstLine="420" w:firstLineChars="200"/>
+              <w:rPr>
+                <w:rFonts w:ascii="Calibri" w:hAnsi="Calibri"/>
+                <w:szCs w:val="22"/>
+              </w:rPr>
+              <w:widowControl w:val="1"/>
+              <w:snapToGrid w:val="0"/>
+            </w:pPr>
+            <w:r>
+              <w:rPr>
+                <w:rFonts w:hint="eastAsia" w:ascii="Calibri" w:hAnsi="Calibri"/>
+                <w:szCs w:val="22"/>
+                <w:color w:val="000000"/>
+              </w:rPr>
+              <w:t xml:space="preserve">写入故障与强制终止另行补测24种场景，通过24种。明文和加密分别检查打包、封装、解码、恢复写入返回ENOSPC，刷写或发布失败，权限恢复失败，以及EINTR和短写入。失败场景没有发布目标，已保存备份保持不变，同名目标重试成功。4种实际SIGKILL场景在观察到至少4MiB写入后强制结束，私有暂存根目录以0700权限遗留，正常重试不删除旧暂存。详细范围、源码和原始记录见test-results/fault-injection-020.md及对应JSON；没有实际占满磁盘或断电，不并入97项核心用例。</w:t>
+            </w:r>
+          </w:p>
+          <w:p>
+            <w:pPr>
               <w:widowControl w:val="1"/>
               <w:jc w:val="left"/>
               <w:rPr>
@@ -13752,7 +13793,7 @@
                 <w:szCs w:val="22"/>
                 <w:color w:val="000000"/>
               </w:rPr>
-              <w:t xml:space="preserve">计划连续运行20小时，同时执行定时任务和加密watch任务，每5分钟检查保留份数、verify、恢复哈希、软硬链接、FIFO及只读目录。记录开始时间为2026年10月29日 10:54（北京时间）；报告读取时已运行1.84小时，完成22次检查。当前状态为running。</w:t>
+              <w:t xml:space="preserve">第一次持续运行在52次正常检查后中断，最后记录时长为4.34小时。核对时原进程已不存在，退出原因尚未确定。该次不认定20小时通过，也不与后续运行时长相加；观察记录见soak-interrupted-20261029.json。</w:t>
             </w:r>
           </w:p>
           <w:p>
@@ -13772,7 +13813,7 @@
                 <w:szCs w:val="22"/>
                 <w:color w:val="000000"/>
               </w:rPr>
-              <w:t xml:space="preserve">尚未达到结束条件，当前不能写为“20小时通过”。最终报告应在进程结束后重新生成。</w:t>
+              <w:t xml:space="preserve">计划连续运行20小时，同时执行定时任务和加密watch任务，每5分钟检查保留份数、verify、恢复哈希、软硬链接、FIFO及只读目录。记录开始时间为2026年10月29日 15:22（北京时间）；报告读取时已运行1.42小时，完成17次检查。当前状态为running。</w:t>
             </w:r>
           </w:p>
           <w:p>
@@ -13792,7 +13833,7 @@
                 <w:szCs w:val="22"/>
                 <w:color w:val="000000"/>
               </w:rPr>
-              <w:t xml:space="preserve">长期测试冻结的CLI与本报告构建的CLI哈希不同，结论只适用于各自记录的二进制。完整SHA256分别保存在长期测试记录和test-results/summary.json中。</w:t>
+              <w:t xml:space="preserve">尚未达到结束条件，当前不能写为“20小时通过”。最终报告应在进程结束后重新生成。</w:t>
             </w:r>
           </w:p>
           <w:p>
@@ -13812,7 +13853,7 @@
                 <w:szCs w:val="22"/>
                 <w:color w:val="000000"/>
               </w:rPr>
-              <w:t xml:space="preserve">长测启动后的源码整理仅为头文件包含、等价类型转换和长字符串换行。重建前后Mach-O文件映射节逐字节一致，见lint-rebuild-comparison.json；完整文件仍有调试或链接信息差异，因此保留两份哈希与适用范围。</w:t>
+              <w:t xml:space="preserve">长测结论对应冻结CLI，完整哈希与报告构建不同；两份文件的Mach-O映射节逐字节一致。等价源码整理、调试与链接差异及两份哈希见lint-rebuild-comparison.json。</w:t>
             </w:r>
           </w:p>
           <w:p>
@@ -13880,7 +13921,7 @@
                 <w:szCs w:val="22"/>
                 <w:color w:val="000000"/>
               </w:rPr>
-              <w:t xml:space="preserve">仍需真实环境检查的项目包括系统文件选择器、跨机器运行、外置卷和网络卷、磁盘耗尽、强制终止、掉电持久性、异属主恢复、ACL与文件flags。未实现的功能不作为本轮通过项。</w:t>
+              <w:t xml:space="preserve">仍需真实环境检查的项目包括系统文件选择器、跨机器运行、外置卷和网络卷、真实磁盘耗尽、掉电持久性、异属主恢复、ACL与文件flags。强制终止只验证了补测中列出的时机和输入；未实现的功能不作为本轮通过项。</w:t>
             </w:r>
           </w:p>
           <w:p>
@@ -13900,7 +13941,7 @@
                 <w:szCs w:val="22"/>
                 <w:color w:val="000000"/>
               </w:rPr>
-              <w:t xml:space="preserve">复现方式：make test；make sanitize；python3 tests/benchmark.py build/squirrel；应用可执行文件加--self-test与一个新的测试目录路径。长期测试使用tests/soak.py，运行目录必须为新目录；不要将工作用文件夹作为压力测试数据。</w:t>
+              <w:t xml:space="preserve">复现命令见README：make test、make sanitize及tests/benchmark.py。GUI自测使用--self-test，长测脚本为tests/soak.py；两者均使用新的测试目录，不使用工作数据。</w:t>
             </w:r>
           </w:p>
         </w:tc>
@@ -14028,7 +14069,7 @@
                 <w:szCs w:val="22"/>
                 <w:color w:val="000000"/>
               </w:rPr>
-              <w:t xml:space="preserve">三位成员分别补充本人AI工具使用截图，说明问题、采用的修改及验证结果。自动执行记录归入项目证据，个人学习经历由本人确认。</w:t>
+              <w:t xml:space="preserve">Codex适合定位跨文件调用、补充异常路径用例和同步文档，减少了反复查找与修改的工作。文件系统竞态、权限和取消时序则需要实际运行确认；工具提出的解释必须与失败样例、代码差异和测试记录对照。</w:t>
             </w:r>
           </w:p>
         </w:tc>
@@ -14113,7 +14154,7 @@
                 <w:szCs w:val="22"/>
                 <w:color w:val="000000"/>
               </w:rPr>
-              <w:t xml:space="preserve">当前97项命名自动测试通过，Sanitizer复测通过；GUI内部断言另行统计。长期测试状态见测试报告，未结束时不认定通过。实际系统选择器、跨机器运行、外置卷和故障注入仍有验证空缺，软件不承诺断电事务持久性。</w:t>
+              <w:t xml:space="preserve">当前97项命名自动测试通过，Sanitizer复测通过；GUI内部断言另行统计。长期测试状态见测试报告，未结束时不认定通过。故障补测与人工验收的范围详见测试报告。</w:t>
             </w:r>
           </w:p>
         </w:tc>
@@ -14122,6 +14163,7 @@
         <w:trPr>
           <w:trHeight w:val="2948" w:hRule="atLeast"/>
           <w:jc w:val="center"/>
+          <w:cantSplit/>
         </w:trPr>
         <w:tc>
           <w:tcPr>
@@ -14178,7 +14220,7 @@
                 <w:szCs w:val="22"/>
                 <w:color w:val="000000"/>
               </w:rPr>
-              <w:t xml:space="preserve">以下按均衡主责整理技术复核稿，供三位成员阅读代码、复现测试后确认和补充。</w:t>
+              <w:t xml:space="preserve">以下从文件恢复、格式算法、界面任务三个职责方向，总结实现中的问题及处理方法。</w:t>
             </w:r>
           </w:p>
           <w:p>
@@ -14406,7 +14448,7 @@
                 <w:szCs w:val="22"/>
                 <w:color w:val="000000"/>
               </w:rPr>
-              <w:t xml:space="preserve">跨平台实验可按能力选择工具，例如macOS上的Sanitizer与系统调试器。答辩前由三人复现主责模块，交叉核对代码、报告和UML，并补齐证书、在线仓库及本人截图。</w:t>
+              <w:t xml:space="preserve">跨平台实验可按能力选择工具，例如macOS上的Sanitizer与系统调试器。本机验收同时检查程序、模型和放映效果；三位成员分别解释主责模块，并能交叉说明备份与恢复的完整过程。</w:t>
             </w:r>
           </w:p>
         </w:tc>

</xml_diff>

<commit_message>
Complete desktop acceptance and redesign the course defense materials
</commit_message>
<xml_diff>
--- a/docs/第3组_松鼠备份_实验报告.docx
+++ b/docs/第3组_松鼠备份_实验报告.docx
@@ -9030,7 +9030,7 @@
                 <w:szCs w:val="22"/>
                 <w:color w:val="000000"/>
               </w:rPr>
-              <w:t xml:space="preserve">备份发布前刷写单文件，但未实现所有恢复文件及父目录的 fsync 链，因此不承诺断电事务持久性。跨卷、跨平台和超大容量仍需实测。本轮变更的自动验证以03测试报告为准；仍需GUI真实点击、重启后参数记忆、密码为空及忙碌关闭/退出的交互验收。后续可评估可恢复调度状态、事件驱动监测和更完整元数据支持。</w:t>
+              <w:t xml:space="preserve">备份发布前刷写单文件，但未实现所有恢复文件及父目录的 fsync 链，因此不承诺断电事务持久性。跨卷、跨平台和超大容量仍需实测。本轮变更的自动验证以03测试报告为准；本机桌面验收已检查真实点击、重启后的参数记忆、密码清空及忙碌时关闭和退出。后续可评估可恢复调度状态、事件驱动监测和更完整元数据支持。</w:t>
             </w:r>
           </w:p>
         </w:tc>
@@ -9106,7 +9106,7 @@
                 <w:szCs w:val="22"/>
                 <w:color w:val="000000"/>
               </w:rPr>
-              <w:t xml:space="preserve">版本 0.2.0。整理时间 2026年10月29日 16:52（北京时间）。本轮命名测试 97 项，通过 97 项。结果来自可复现的测试程序及其 XML、JSON 和日志。GUI 内部断言与核心用例分开统计；未完成的长期测试不写成通过。</w:t>
+              <w:t xml:space="preserve">版本 0.2.0。整理时间 2026年10月29日 21:54（北京时间）。本轮命名测试 97 项，通过 97 项。结果来自可复现的测试程序及其 XML、JSON 和日志。GUI 内部断言、桌面验收与核心用例分别统计。</w:t>
             </w:r>
           </w:p>
           <w:p>
@@ -12740,7 +12740,7 @@
                 <w:szCs w:val="22"/>
                 <w:color w:val="000000"/>
               </w:rPr>
-              <w:t xml:space="preserve">测试没有操作系统文件选择器，也没有使用鼠标点击，因此系统授权、选择器行为和完整人工操作链仍需要验收。切换页面、按钮处理和关闭代理方法的内部测试不能替代这部分结论。</w:t>
+              <w:t xml:space="preserve">另在李想的Mac上通过系统辅助功能和鼠标、键盘事件执行12项桌面验收，覆盖六个文件选择器的选择与取消、中文空格路径、拒绝覆盖、错误密码、定时保留、变化检测及运行中停止。备份中关闭窗口和恢复中退出均完成清理后结束进程；重启恢复参数，不保存密码，也不自动启动任务。此项使用普通发布应用，未进入内部自测模式。</w:t>
             </w:r>
           </w:p>
           <w:p>
@@ -12763,9 +12763,9 @@
               </w:rPr>
               <w:drawing>
                 <wp:inline distT="0" distB="0" distL="0" distR="0">
-                  <wp:extent cx="5852160" cy="4280747"/>
+                  <wp:extent cx="5852160" cy="4432469"/>
                   <wp:effectExtent l="0" t="0" r="0" b="0"/>
-                  <wp:docPr id="5009" name="图9 恢复完成的应用状态" descr="图9 恢复完成的应用状态"/>
+                  <wp:docPr id="5009" name="图9 桌面验收中恢复完成的实际窗口" descr="图9 桌面验收中恢复完成的实际窗口"/>
                   <wp:cNvGraphicFramePr/>
                   <a:graphic xmlns:a="http://schemas.openxmlformats.org/drawingml/2006/main">
                     <a:graphicData uri="http://schemas.openxmlformats.org/drawingml/2006/picture">
@@ -12790,7 +12790,7 @@
                         <pic:spPr>
                           <a:xfrm>
                             <a:off x="0" y="0"/>
-                            <a:ext cx="5852160" cy="4280747"/>
+                            <a:ext cx="5852160" cy="4432469"/>
                           </a:xfrm>
                           <a:prstGeom prst="rect">
                             <a:avLst/>
@@ -12825,7 +12825,7 @@
                 <w:szCs w:val="22"/>
                 <w:color w:val="000000"/>
               </w:rPr>
-              <w:t xml:space="preserve">图9 恢复完成的应用状态</w:t>
+              <w:t xml:space="preserve">图9 桌面验收中恢复完成的实际窗口</w:t>
             </w:r>
           </w:p>
           <w:p>
@@ -12845,7 +12845,7 @@
                 <w:szCs w:val="22"/>
                 <w:color w:val="000000"/>
               </w:rPr>
-              <w:t xml:space="preserve">错误密码时显示中文原因并拒绝发布恢复目录；取消后恢复输入状态并清理暂存。对应完整运行截图保存在docs/screenshots/02-wrong-password.png与06-cancelled.png，事件顺序见test-results/gui-events.txt。</w:t>
+              <w:t xml:space="preserve">错误密码时显示中文原因并拒绝发布恢复目录；取消后恢复输入状态并清理暂存。桌面验收结果见test-results/gui-desktop-acceptance.json，截图位于docs/screenshots/desktop。恢复核对排除系统自动维护的com.apple.macl与com.apple.provenance；用户扩展属性仍严格比较。验收工具另通过13项正反例检查。</w:t>
             </w:r>
           </w:p>
           <w:p>
@@ -13010,7 +13010,7 @@
                 <w:lang w:bidi="ar"/>
               </w:rPr>
               <w:keepNext/>
-              <w:spacing w:before="400"/>
+              <w:spacing w:before="1300"/>
               <w:snapToGrid w:val="0"/>
             </w:pPr>
             <w:r>
@@ -13813,7 +13813,7 @@
                 <w:szCs w:val="22"/>
                 <w:color w:val="000000"/>
               </w:rPr>
-              <w:t xml:space="preserve">计划连续运行20小时，同时执行定时任务和加密watch任务，每5分钟检查保留份数、verify、恢复哈希、软硬链接、FIFO及只读目录。记录开始时间为2026年10月29日 15:22（北京时间）；报告读取时已运行1.42小时，完成17次检查。当前状态为running。</w:t>
+              <w:t xml:space="preserve">后一次定时与加密watch联合观察从2026年10月29日15:22开始，最后有效检查覆盖5.76小时，共69次，记录中无错误。此后取消连续20小时测试安排，核对时进程已经结束，未再重启；不能据此认定20小时通过。课程材料没有连续20小时测试要求，本次保留观察记录，不再作为交付前置条件。原始记录及取消说明见soak-observation-20261029.raw.json与soak-cancelled-20261029.json。</w:t>
             </w:r>
           </w:p>
           <w:p>
@@ -13833,27 +13833,7 @@
                 <w:szCs w:val="22"/>
                 <w:color w:val="000000"/>
               </w:rPr>
-              <w:t xml:space="preserve">尚未达到结束条件，当前不能写为“20小时通过”。最终报告应在进程结束后重新生成。</w:t>
-            </w:r>
-          </w:p>
-          <w:p>
-            <w:pPr>
-              <w:spacing w:line="360" w:lineRule="auto"/>
-              <w:ind w:firstLine="420" w:firstLineChars="200"/>
-              <w:rPr>
-                <w:rFonts w:ascii="Calibri" w:hAnsi="Calibri"/>
-                <w:szCs w:val="22"/>
-              </w:rPr>
-              <w:widowControl w:val="1"/>
-              <w:snapToGrid w:val="0"/>
-            </w:pPr>
-            <w:r>
-              <w:rPr>
-                <w:rFonts w:hint="eastAsia" w:ascii="Calibri" w:hAnsi="Calibri"/>
-                <w:szCs w:val="22"/>
-                <w:color w:val="000000"/>
-              </w:rPr>
-              <w:t xml:space="preserve">长测结论对应冻结CLI，完整哈希与报告构建不同；两份文件的Mach-O映射节逐字节一致。等价源码整理、调试与链接差异及两份哈希见lint-rebuild-comparison.json。</w:t>
+              <w:t xml:space="preserve">观察使用冻结CLI，二进制对应关系见lint-rebuild-comparison.json。</w:t>
             </w:r>
           </w:p>
           <w:p>
@@ -13921,7 +13901,7 @@
                 <w:szCs w:val="22"/>
                 <w:color w:val="000000"/>
               </w:rPr>
-              <w:t xml:space="preserve">仍需真实环境检查的项目包括系统文件选择器、跨机器运行、外置卷和网络卷、真实磁盘耗尽、掉电持久性、异属主恢复、ACL与文件flags。强制终止只验证了补测中列出的时机和输入；未实现的功能不作为本轮通过项。</w:t>
+              <w:t xml:space="preserve">本轮未覆盖跨机器运行、外置卷和网络卷、真实磁盘耗尽、掉电持久性、异属主恢复、ACL与文件flags。强制终止只验证了补测中列出的时机和输入；未实现的功能不作为本轮通过项。</w:t>
             </w:r>
           </w:p>
           <w:p>
@@ -14028,7 +14008,7 @@
                 <w:szCs w:val="22"/>
                 <w:color w:val="000000"/>
               </w:rPr>
-              <w:t xml:space="preserve">本轮使用Codex辅助读取课程资料、审阅C++与Objective-C++代码、修复恢复权限和变化检测问题、实现取消与进度、编写回归测试、整理UML模型及报告。实际命令由工具执行，编译输出、测试结果和修改差异保存在项目目录。</w:t>
+              <w:t xml:space="preserve">开发中使用Codex查找跨文件调用、分析恢复权限和取消时序、补充测试，并整理文档。修改后通过编译、回归测试及桌面操作检查结果。</w:t>
             </w:r>
           </w:p>
           <w:p>
@@ -14039,7 +14019,6 @@
                 <w:rFonts w:ascii="Calibri" w:hAnsi="Calibri"/>
                 <w:szCs w:val="22"/>
               </w:rPr>
-              <w:keepLines/>
               <w:widowControl w:val="1"/>
               <w:snapToGrid w:val="0"/>
             </w:pPr>
@@ -14049,7 +14028,7 @@
                 <w:szCs w:val="22"/>
                 <w:color w:val="000000"/>
               </w:rPr>
-              <w:t xml:space="preserve">工具生成的内容不能直接代替验证。比如，备份文件可生成并不等于可以在只读目录权限下正确恢复；停止按钮存在也不等于正在执行的任务会响应。相应问题分别通过失败复现、代码修订和回归断言检查。</w:t>
+              <w:t xml:space="preserve">只读目录恢复曾暴露权限设置顺序问题；停止操作则需要检查任务是否响应，以及失败后是否残留半成品。相关处理均保留代码差异和测试记录，不能仅凭工具给出的解释判断正确。</w:t>
             </w:r>
           </w:p>
           <w:p>
@@ -14069,7 +14048,7 @@
                 <w:szCs w:val="22"/>
                 <w:color w:val="000000"/>
               </w:rPr>
-              <w:t xml:space="preserve">Codex适合定位跨文件调用、补充异常路径用例和同步文档，减少了反复查找与修改的工作。文件系统竞态、权限和取消时序则需要实际运行确认；工具提出的解释必须与失败样例、代码差异和测试记录对照。</w:t>
+              <w:t xml:space="preserve">【待补：在此插入本项目真实AI工具使用截图，并简要说明输入的问题、采用的修改和验证结果。由组员补充。】</w:t>
             </w:r>
           </w:p>
         </w:tc>
@@ -14154,7 +14133,7 @@
                 <w:szCs w:val="22"/>
                 <w:color w:val="000000"/>
               </w:rPr>
-              <w:t xml:space="preserve">当前97项命名自动测试通过，Sanitizer复测通过；GUI内部断言另行统计。长期测试状态见测试报告，未结束时不认定通过。故障补测与人工验收的范围详见测试报告。</w:t>
+              <w:t xml:space="preserve">97项命名自动测试和Sanitizer复测通过，另完成53项GUI内部断言及12项桌面验收。定时与变化检测的持续观察保留实际检查记录；没有完成连续20小时运行，不作该时长的通过结论。</w:t>
             </w:r>
           </w:p>
         </w:tc>

</xml_diff>

<commit_message>
Refine source structure and compact course deliverables
</commit_message>
<xml_diff>
--- a/docs/第3组_松鼠备份_实验报告.docx
+++ b/docs/第3组_松鼠备份_实验报告.docx
@@ -767,7 +767,7 @@
                 <w:szCs w:val="22"/>
                 <w:color w:val="000000"/>
               </w:rPr>
-              <w:t xml:space="preserve">选做功能包括软硬链接与FIFO、基础元数据、六类筛选、打包压缩、密码加密、图形界面、定时任务、目录变化检测与任务内保留策略。设备节点、socket、网络备份、增量备份和系统守护未实现。</w:t>
+              <w:t xml:space="preserve">选做功能包括软硬链接与FIFO、基础元数据、六类筛选、打包压缩、密码加密、图形界面、定时任务、目录变化检测与任务内保留策略。</w:t>
             </w:r>
           </w:p>
           <w:p>
@@ -787,7 +787,7 @@
                 <w:szCs w:val="22"/>
                 <w:color w:val="000000"/>
               </w:rPr>
-              <w:t xml:space="preserve">交付包含源代码、构建脚本、程序、UML可编辑模型、需求与设计文档、测试证据、报告和答辩材料。0.2.0加入协作取消、阶段进度和发布前源目录复查。运行结果按实际测试记录填写。</w:t>
+              <w:t xml:space="preserve">备份、验证与恢复共用核心服务，支持取消、阶段进度和源目录复查。</w:t>
             </w:r>
           </w:p>
         </w:tc>
@@ -841,7 +841,7 @@
                 <w:szCs w:val="22"/>
                 <w:color w:val="000000"/>
               </w:rPr>
-              <w:t xml:space="preserve">开发与测试平台为macOS 13.0、Apple Silicon arm64。使用Apple Clang 14.0.3、Command Line Tools、make、git、GoogleTest和Python；GUI使用Cocoa/AppKit。UML模型由StarUML 7.1.1后台读取验证，报告采用课程原DOCX模板。</w:t>
+              <w:t xml:space="preserve">开发与测试平台为macOS 13.0、Apple Silicon arm64。使用Apple Clang 14.0.3、Command Line Tools、make、git、GoogleTest和Python；GUI使用Cocoa/AppKit。UML建模工具为StarUML 7.1.1。</w:t>
             </w:r>
           </w:p>
         </w:tc>
@@ -951,7 +951,7 @@
                 <w:szCs w:val="22"/>
                 <w:color w:val="000000"/>
               </w:rPr>
-              <w:t xml:space="preserve">版本 0.2.0。本文依据《软件开发综合实验》的实验要求、讲义和报告模板，定义 macOS 本地备份软件当前范围，作为设计、编码、测试和验收的共同基线。优先级以数据正确性、原文件保护、操作易用性和扩展功能完整性为序。</w:t>
+              <w:t xml:space="preserve">版本 0.2.0。松鼠备份用于保存和恢复本地目录树。本说明书定义功能、使用条件与验收标准，备份内容完整、恢复结果正确和已有文件不被覆盖是首要要求。</w:t>
             </w:r>
           </w:p>
           <w:p>
@@ -1140,7 +1140,7 @@
                 <w:szCs w:val="22"/>
                 <w:color w:val="000000"/>
               </w:rPr>
-              <w:t xml:space="preserve">本轮复核宿主为 macOS 13.0、arm64、Apple Clang 14.0.3、Command Line Tools；0.2.0 的部署目标统一为 macOS 13.0。原0.1.0报告记录的平台不作为本轮实测环境，其他系统版本和机器仍需实测。使用本机磁盘，目标父目录必须存在。建议测试时预留原始数据数倍的可用空间，因为打包、加密和恢复暂存会产生中间文件。</w:t>
+              <w:t xml:space="preserve">开发与测试环境为 macOS 13.0、Apple Silicon arm64、Apple Clang 14.0.3 和 Command Line Tools，部署目标为 macOS 13.0。使用本机磁盘，目标父目录必须存在。建议测试时预留原始数据数倍的可用空间，因为打包、加密和恢复暂存会产生中间文件。</w:t>
             </w:r>
           </w:p>
           <w:p>
@@ -3742,7 +3742,7 @@
                 <w:szCs w:val="22"/>
                 <w:color w:val="000000"/>
               </w:rPr>
-              <w:t xml:space="preserve">当前不包含网盘服务、用户管理、网络传输、增量、系统守护进程、设备节点、socket、ACL、文件 flags 或备份浏览器中的单文件提取。遇到不支持的特殊类型会失败并明确提示，不静默丢失。</w:t>
+              <w:t xml:space="preserve">备份以本地目录树为单位，生成完整快照。遇到设备节点或 socket 时终止并提示文件类型错误。</w:t>
             </w:r>
           </w:p>
           <w:p>
@@ -3909,7 +3909,7 @@
                 <w:szCs w:val="22"/>
                 <w:color w:val="000000"/>
               </w:rPr>
-              <w:t xml:space="preserve">用例 UC-07 启动实时任务。前置条件同 UC-06。系统立即备份，然后轮询被筛选目录的元数据；发现变化后等待下一次观察确认稳定，再执行备份。持续变化时继续等待；任务失败会重试。停止后的后置条件同 UC-06。不承诺内核事件级延迟或事务级文件系统一致性。</w:t>
+              <w:t xml:space="preserve">用例 UC-07 启动实时任务。前置条件同 UC-06。系统立即备份，然后轮询被筛选目录的元数据；发现变化后等待下一次观察确认稳定，再执行备份。持续变化时继续等待；任务失败会重试。停止后的后置条件同 UC-06。</w:t>
             </w:r>
           </w:p>
           <w:p>
@@ -4034,7 +4034,7 @@
                 <w:szCs w:val="22"/>
                 <w:color w:val="000000"/>
               </w:rPr>
-              <w:t xml:space="preserve">模型文件位于 docs/uml/SquirrelBackup.mdj；用例编号与上述描述一致。</w:t>
+              <w:t xml:space="preserve">可编辑模型为SquirrelBackup.mdj，随设计附件提供；用例编号与上述描述一致。</w:t>
             </w:r>
           </w:p>
           <w:p>
@@ -4156,7 +4156,7 @@
                 <w:szCs w:val="22"/>
                 <w:color w:val="000000"/>
               </w:rPr>
-              <w:t xml:space="preserve">通过操作系统文件系统接口读写本地存储，无自定义硬件协议。软件不直接访问块设备，不要求管理员权限。外置卷的元数据能力和授权不属于当前实测范围。</w:t>
+              <w:t xml:space="preserve">通过操作系统文件系统接口读写本地存储，无自定义硬件协议。程序以当前用户权限运行。</w:t>
             </w:r>
           </w:p>
           <w:p>
@@ -4203,7 +4203,7 @@
                 <w:szCs w:val="22"/>
                 <w:color w:val="000000"/>
               </w:rPr>
-              <w:t xml:space="preserve">核心公开头文件为 include/squirrel/backup.h。BackupService 提供 backup、inspect、restore；Scheduler 提供 run。运行时依赖 C++ 标准库、POSIX、Cocoa 和 CommonCrypto/Security。自定义文件格式版本固定为 1，未知版本拒绝；不承诺与 tar、Time Machine 等其他格式互通。</w:t>
+              <w:t xml:space="preserve">核心公开头文件为 include/squirrel/backup.h。BackupService 提供 backup、inspect、restore；Scheduler 提供 run。运行时依赖 C++ 标准库、POSIX、Cocoa 和 CommonCrypto/Security。自定义文件格式版本为 1，读取未知版本时返回格式错误。</w:t>
             </w:r>
           </w:p>
           <w:p>
@@ -4271,7 +4271,7 @@
                 <w:szCs w:val="22"/>
                 <w:color w:val="000000"/>
               </w:rPr>
-              <w:t xml:space="preserve">资源 NFR-04：普通文件按 1 MiB 块处理，内存还包含全量条目与元数据列表，不宣称总体常量内存。格式设定单文件 1 TiB、条目数 100 万、文本字段 64 KiB、每条目 xattrs 总计 64 MiB 的上限；这些是防御性边界，不是已完成的容量测试指标。性能 NFR-05：提供本机实测时间、输入输出大小和哈希比对结果，不把缓存条件下的测量作为吞吐承诺。</w:t>
+              <w:t xml:space="preserve">资源 NFR-04：普通文件按 1 MiB 块处理，内存还保存全量条目与元数据列表。格式设定单文件 1 TiB、条目数 100 万、文本字段 64 KiB、每条目 xattrs 总计 64 MiB 的上限；读取归档时逐项检查这些限制。性能 NFR-05：记录备份、恢复耗时和归档大小，并核对恢复内容的哈希。</w:t>
             </w:r>
           </w:p>
           <w:p>
@@ -4307,7 +4307,7 @@
                 <w:lang w:bidi="ar"/>
               </w:rPr>
               <w:keepNext/>
-              <w:spacing w:before="960"/>
+              <w:spacing w:before="1600"/>
               <w:snapToGrid w:val="0"/>
             </w:pPr>
             <w:r>
@@ -4367,7 +4367,7 @@
                 <w:szCs w:val="22"/>
                 <w:color w:val="000000"/>
               </w:rPr>
-              <w:t xml:space="preserve">第3组组长杨梦宇（2023150901002）负责扫描、筛选、安全恢复与 CLI；郭畅（2023040904017）负责归档协议、Huffman 与密码封装；李想（2023150901012）负责原生界面、自动任务和集成发布。每人还承担对应测试、建模、文档和演示，按30个相对工作量点均衡安排。任务点是后续分工尺度，不是已经发生的工时或历史贡献比例。具体交付标准见三人分工方案。</w:t>
+              <w:t xml:space="preserve">第3组组长杨梦宇（2023150901002）负责扫描、筛选、安全恢复与 CLI；郭畅（2023040904017）负责归档协议、Huffman 与密码封装；李想（2023150901012）负责原生界面、自动任务和集成发布。三人分别承担对应模块的测试、建模、文档与讲解，并交叉复核备份和恢复流程。</w:t>
             </w:r>
           </w:p>
           <w:p>
@@ -4414,7 +4414,7 @@
                 <w:szCs w:val="22"/>
                 <w:color w:val="000000"/>
               </w:rPr>
-              <w:t xml:space="preserve">已有代码和自动测试作为接手基线。以下为2026年10月29日起至答辩前的计划，实际完成时间应由成员根据提交和复核记录更新。</w:t>
+              <w:t xml:space="preserve">以下为答辩前的组内复核与排练计划。</w:t>
             </w:r>
           </w:p>
           <w:tbl>
@@ -5262,7 +5262,7 @@
                 <w:szCs w:val="22"/>
                 <w:color w:val="000000"/>
               </w:rPr>
-              <w:t xml:space="preserve">公开仓库：https://github.com/Peregrinate-PG/SquirrelBackup。2026年10月29日上传真实Git历史，并经匿名克隆核对源码与提交。后续协作保留实际记录；Teambition等看板属于鼓励项。每位成员的AI学习证书另行提交。</w:t>
+              <w:t xml:space="preserve">项目使用 Git 管理版本，公开仓库为 https://github.com/Peregrinate-PG/SquirrelBackup。构建、测试和文档随版本保存。</w:t>
             </w:r>
           </w:p>
         </w:tc>
@@ -5338,7 +5338,7 @@
                 <w:szCs w:val="22"/>
                 <w:color w:val="000000"/>
               </w:rPr>
-              <w:t xml:space="preserve">版本 0.2.0。本设计对应需求 FR-01 至 FR-24，说明已实现的 C++ 类、文件协议、恢复安全边界和调度逻辑。文档中的方法名以 include/squirrel/backup.h 为准；对应的可编辑UML模型及插图位于docs/uml。</w:t>
+              <w:t xml:space="preserve">版本 0.2.0。本设计对应需求 FR-01 至 FR-24，说明已实现的 C++ 类、文件协议、恢复安全边界和调度逻辑。文档中的方法名以 include/squirrel/backup.h 为准；可编辑UML模型随设计附件提供。</w:t>
             </w:r>
           </w:p>
           <w:p>
@@ -5413,7 +5413,7 @@
                 <w:szCs w:val="22"/>
                 <w:color w:val="000000"/>
               </w:rPr>
-              <w:t xml:space="preserve">本轮构建宿主为 macOS 13.0 arm64、Apple Clang 14.0.3与系统SDK；0.2.0部署目标为macOS 13.0。使用C++17、Objective-C++、make与git。原0.1.0开发环境记录保留在历史材料，不替代本轮环境。通过 -Wall -Wextra -Wpedantic -Werror 编译业务源码；CommonCrypto 的系统废弃声明告警单独屏蔽，不视为算法自研。GoogleTest 执行白盒测试；Python 驱动 CLI 黑盒和性能测试；AddressSanitizer 与 UndefinedBehaviorSanitizer 用于动态检查，适配本机平台而不强行安装 Linux 的 perf 或 valgrind。</w:t>
+              <w:t xml:space="preserve">开发环境为 macOS 13.0 arm64、Apple Clang 14.0.3 与系统 SDK。项目使用 C++17、Objective-C++、make 和 git。编译启用 -Wall -Wextra -Wpedantic -Werror，CommonCrypto 的弃用声明告警单独处理。GoogleTest 执行单元测试，Python 驱动 CLI 集成和性能测试，AddressSanitizer 与 UndefinedBehaviorSanitizer 检查运行时错误。</w:t>
             </w:r>
           </w:p>
           <w:p>
@@ -5460,7 +5460,7 @@
                 <w:szCs w:val="22"/>
                 <w:color w:val="000000"/>
               </w:rPr>
-              <w:t xml:space="preserve">GUI 使用 Cocoa/AppKit，密码封装使用 CommonCrypto/Security。打包、Huffman、筛选和调度由本项目编写。GoogleTest 只链接测试程序。详细来源、许可和扩展功能计分说明见 THIRD_PARTY.md。</w:t>
+              <w:t xml:space="preserve">GUI 使用 Cocoa/AppKit，密码封装使用 CommonCrypto/Security。打包、Huffman、筛选和调度由本项目编写。GoogleTest 只链接测试程序。依赖来源与许可见 THIRD_PARTY.md。</w:t>
             </w:r>
           </w:p>
           <w:p>
@@ -5476,6 +5476,7 @@
                 <w:lang w:bidi="ar"/>
               </w:rPr>
               <w:keepNext/>
+              <w:spacing w:before="480"/>
               <w:snapToGrid w:val="0"/>
             </w:pPr>
             <w:r>
@@ -5535,7 +5536,7 @@
                 <w:szCs w:val="22"/>
                 <w:color w:val="000000"/>
               </w:rPr>
-              <w:t xml:space="preserve">入口层由 cli.cpp 和 gui.mm 构成。CLI 解析参数、读取密码环境变量并处理退出码；GUI 收集输入，在后台队列调用业务服务，在主队列更新日志。业务层由 BackupService 统一编排，Scheduler 提供循环快照。基础模块分为 FileScanner、ArchiveWriter、ArchiveReader、HuffmanCodec 和 CryptoEnvelope。</w:t>
+              <w:t xml:space="preserve">CLI 入口位于 cli.cpp，参数解析与命令执行分别组织。GUI 由 gui_main.mm 启动，gui_layout.mm 构建界面，gui.mm 处理操作与任务状态，gui_support.mm 提供控件和文本转换函数。界面自测单列于 tests/gui_self_test.mm。GUI 在后台队列调用业务服务，在主队列更新控件与日志。业务层由 BackupService 统一编排，Scheduler 提供循环快照。基础模块分为 FileScanner、ArchiveWriter、ArchiveReader、HuffmanCodec 和 CryptoEnvelope。</w:t>
             </w:r>
           </w:p>
           <w:p>
@@ -5555,7 +5556,7 @@
                 <w:szCs w:val="22"/>
                 <w:color w:val="000000"/>
               </w:rPr>
-              <w:t xml:space="preserve">构建时核心源文件生成 libsquirrel.a，GUI 和 CLI 静态链接同一核心。当前不提供对外稳定 C ABI 或动态库；若后续需要脚本 UI 或插件，才考虑增加不传播 C++ 异常的 C 接口。组件图需要展示两个入口对同一核心库的依赖及核心库对文件系统、密码库的依赖，模型中的构件依赖与本节一致。</w:t>
+              <w:t xml:space="preserve">构建时核心源文件生成 libsquirrel.a，GUI 和 CLI 静态链接同一核心。组件图展示入口、核心模块与系统文件接口、密码库之间的依赖。</w:t>
             </w:r>
           </w:p>
           <w:p>
@@ -5735,7 +5736,7 @@
                 <w:szCs w:val="22"/>
                 <w:color w:val="000000"/>
               </w:rPr>
-              <w:t xml:space="preserve">核心类关系以静态工具方法依赖为主：BackupService 依赖 FileScanner、ArchiveWriter、ArchiveReader、CryptoEnvelope；ArchiveWriter 和 ArchiveReader 依赖 HuffmanCodec；Scheduler 依赖 BackupService、BackupOptions 与 ScheduleOptions。它们不通过继承形成多态层次，不应在类图中臆造父类。</w:t>
+              <w:t xml:space="preserve">核心类关系以静态工具方法依赖为主：BackupService 依赖 FileScanner、ArchiveWriter、ArchiveReader、CryptoEnvelope；ArchiveWriter 和 ArchiveReader 依赖 HuffmanCodec；Scheduler 依赖 BackupService、BackupOptions 与 ScheduleOptions。服务之间通过调用协作。</w:t>
             </w:r>
           </w:p>
           <w:p>
@@ -8581,7 +8582,7 @@
                 <w:szCs w:val="22"/>
                 <w:color w:val="000000"/>
               </w:rPr>
-              <w:t xml:space="preserve">取消是协作式处理：一次文件系统调用、PBKDF2派生或单块Huffman计算仍需返回后才能响应。未提供固定毫秒级时限，也未使用强制线程终止。</w:t>
+              <w:t xml:space="preserve">取消检查位于工作单元之间；正在执行的文件系统调用、PBKDF2 派生或单块 Huffman 计算返回后，继续处理停止请求。</w:t>
             </w:r>
           </w:p>
           <w:p>
@@ -8828,7 +8829,7 @@
                 <w:szCs w:val="22"/>
                 <w:color w:val="000000"/>
               </w:rPr>
-              <w:t xml:space="preserve">PBKDF2-HMAC-SHA256 固定 200000 轮，派生 64 字节，前 32 字节为 AES-256 密钥，后 32 字节为 HMAC 密钥。salt 和 IV 分别由安全随机数生成，AES 使用 CBC 与 PKCS7 补齐。认证标签逐字节异或累计后判断，先验证后解密，不把密码摘要直接保存成可用于解密的密钥。密码最低 8 UTF-8 字节，并不代表强度保证；不存在找回机制。</w:t>
+              <w:t xml:space="preserve">PBKDF2-HMAC-SHA256 固定 200000 轮，派生 64 字节，前 32 字节为 AES-256 密钥，后 32 字节为 HMAC 密钥。salt 和 IV 分别由安全随机数生成，AES 使用 CBC 与 PKCS7 补齐。认证标签逐字节异或累计后判断，先验证后解密，不把密码摘要直接保存成可用于解密的密钥。密码至少为 8 个 UTF-8 字节，由用户自行保存。</w:t>
             </w:r>
           </w:p>
           <w:p>
@@ -8990,7 +8991,7 @@
                 <w:szCs w:val="28"/>
                 <w:lang w:bidi="ar"/>
               </w:rPr>
-              <w:t xml:space="preserve">6 风险与迭代</w:t>
+              <w:t xml:space="preserve">6 文件系统处理约定</w:t>
             </w:r>
           </w:p>
           <w:p>
@@ -9030,7 +9031,7 @@
                 <w:szCs w:val="22"/>
                 <w:color w:val="000000"/>
               </w:rPr>
-              <w:t xml:space="preserve">备份发布前刷写单文件，但未实现所有恢复文件及父目录的 fsync 链，因此不承诺断电事务持久性。跨卷、跨平台和超大容量仍需实测。本轮变更的自动验证以03测试报告为准；本机桌面验收已检查真实点击、重启后的参数记忆、密码清空及忙碌时关闭和退出。后续可评估可恢复调度状态、事件驱动监测和更完整元数据支持。</w:t>
+              <w:t xml:space="preserve">备份发布前刷写单文件，但未实现所有恢复文件及父目录的 fsync 链，因此不承诺断电事务持久性。跨卷、跨平台和超大容量仍需实测。测试报告记录了参数记忆、密码清空及忙碌时关闭和退出的检查结果。</w:t>
             </w:r>
           </w:p>
         </w:tc>
@@ -9106,7 +9107,7 @@
                 <w:szCs w:val="22"/>
                 <w:color w:val="000000"/>
               </w:rPr>
-              <w:t xml:space="preserve">版本 0.2.0。整理时间 2026年10月29日 21:54（北京时间）。本轮命名测试 97 项，通过 97 项。结果来自可复现的测试程序及其 XML、JSON 和日志。GUI 内部断言、桌面验收与核心用例分别统计。</w:t>
+              <w:t xml:space="preserve">版本 0.2.0。整理时间 2026年10月30日 01:02（北京时间）。自动测试 97 项，通过 97 项。GUI、桌面验收和补充测试在对应章节单列。</w:t>
             </w:r>
           </w:p>
           <w:p>
@@ -9948,7 +9949,7 @@
                 <w:szCs w:val="22"/>
                 <w:color w:val="000000"/>
               </w:rPr>
-              <w:t xml:space="preserve">下表给出输入、操作和可判断的预期结果。版本与日期同报告首页；实际结果“通过”只表示相应自动断言成立。更详细的准备步骤可直接在tests目录对应函数中复现。</w:t>
+              <w:t xml:space="preserve">下表给出输入、操作和可判断的预期结果。测试步骤可在tests目录中的对应函数复现。</w:t>
             </w:r>
           </w:p>
           <w:tbl>
@@ -12671,7 +12672,7 @@
                 <w:szCs w:val="22"/>
                 <w:color w:val="000000"/>
               </w:rPr>
-              <w:t xml:space="preserve">上述T编号是报告场景编号，可能对应一项或多项命名测试，不能再与总用例数相加。</w:t>
+              <w:t xml:space="preserve">表中的T编号按功能场景组织，具体命名用例见test-results/test-matrix.csv。</w:t>
             </w:r>
           </w:p>
           <w:p>
@@ -12687,7 +12688,7 @@
                 <w:lang w:bidi="ar"/>
               </w:rPr>
               <w:keepNext/>
-              <w:spacing w:before="960"/>
+              <w:spacing w:before="1700"/>
               <w:snapToGrid w:val="0"/>
             </w:pPr>
             <w:r>
@@ -12720,7 +12721,7 @@
                 <w:szCs w:val="22"/>
                 <w:color w:val="000000"/>
               </w:rPr>
-              <w:t xml:space="preserve">后台AppKit测试通过 53 项内部断言，覆盖输入校验、密码字段、设置白名单、忙碌状态、加密备份、错误密码、恢复、内容查看、验证、保留数量、停止、取消、关闭和退出请求。界面状态和事件日志从真实应用生成，未用设计稿代替运行结果。</w:t>
+              <w:t xml:space="preserve">AppKit后台测试通过 53 项断言，检查输入校验、密码字段、表单设置、忙碌状态、备份、错误密码、恢复、内容查看、验证、保留数量、停止及退出。</w:t>
             </w:r>
           </w:p>
           <w:p>
@@ -12740,7 +12741,7 @@
                 <w:szCs w:val="22"/>
                 <w:color w:val="000000"/>
               </w:rPr>
-              <w:t xml:space="preserve">另在李想的Mac上通过系统辅助功能和鼠标、键盘事件执行12项桌面验收，覆盖六个文件选择器的选择与取消、中文空格路径、拒绝覆盖、错误密码、定时保留、变化检测及运行中停止。备份中关闭窗口和恢复中退出均完成清理后结束进程；重启恢复参数，不保存密码，也不自动启动任务。此项使用普通发布应用，未进入内部自测模式。</w:t>
+              <w:t xml:space="preserve">2026年10月29日在李想的Mac上完成12项桌面验收，使用系统辅助功能和鼠标、键盘事件检查六个文件选择器、中文空格路径、拒绝覆盖、错误密码、定时保留、变化检测及运行中停止。备份中关闭窗口和恢复中退出均等待清理后结束进程；重启恢复表单参数，密码为空，任务保持停止。</w:t>
             </w:r>
           </w:p>
           <w:p>
@@ -12765,7 +12766,7 @@
                 <wp:inline distT="0" distB="0" distL="0" distR="0">
                   <wp:extent cx="5852160" cy="4432469"/>
                   <wp:effectExtent l="0" t="0" r="0" b="0"/>
-                  <wp:docPr id="5009" name="图9 桌面验收中恢复完成的实际窗口" descr="图9 桌面验收中恢复完成的实际窗口"/>
+                  <wp:docPr id="5009" name="图9 桌面验收中的恢复结果" descr="图9 桌面验收中的恢复结果"/>
                   <wp:cNvGraphicFramePr/>
                   <a:graphic xmlns:a="http://schemas.openxmlformats.org/drawingml/2006/main">
                     <a:graphicData uri="http://schemas.openxmlformats.org/drawingml/2006/picture">
@@ -12825,7 +12826,7 @@
                 <w:szCs w:val="22"/>
                 <w:color w:val="000000"/>
               </w:rPr>
-              <w:t xml:space="preserve">图9 桌面验收中恢复完成的实际窗口</w:t>
+              <w:t xml:space="preserve">图9 桌面验收中的恢复结果</w:t>
             </w:r>
           </w:p>
           <w:p>
@@ -12845,7 +12846,7 @@
                 <w:szCs w:val="22"/>
                 <w:color w:val="000000"/>
               </w:rPr>
-              <w:t xml:space="preserve">错误密码时显示中文原因并拒绝发布恢复目录；取消后恢复输入状态并清理暂存。桌面验收结果见test-results/gui-desktop-acceptance.json，截图位于docs/screenshots/desktop。恢复核对排除系统自动维护的com.apple.macl与com.apple.provenance；用户扩展属性仍严格比较。验收工具另通过13项正反例检查。</w:t>
+              <w:t xml:space="preserve">桌面验收记录见test-results/gui-desktop-cases.json。恢复核对包括内容、权限、时间、软硬链接、FIFO和用户扩展属性；系统维护的com.apple.macl与com.apple.provenance不参与比对。</w:t>
             </w:r>
           </w:p>
           <w:p>
@@ -12861,7 +12862,6 @@
                 <w:lang w:bidi="ar"/>
               </w:rPr>
               <w:keepNext/>
-              <w:spacing w:before="480"/>
               <w:snapToGrid w:val="0"/>
             </w:pPr>
             <w:r>
@@ -12874,7 +12874,7 @@
                 <w:szCs w:val="28"/>
                 <w:lang w:bidi="ar"/>
               </w:rPr>
-              <w:t xml:space="preserve">4 编译检查与动态内存检查</w:t>
+              <w:t xml:space="preserve">4 编译与补充检查</w:t>
             </w:r>
           </w:p>
           <w:p>
@@ -12894,7 +12894,7 @@
                 <w:szCs w:val="22"/>
                 <w:color w:val="000000"/>
               </w:rPr>
-              <w:t xml:space="preserve">业务代码以-Wall -Wextra -Wpedantic -Werror编译通过。CommonCrypto系统接口的弃用告警按项目构建选项单独处理。make sanitize以AddressSanitizer与UndefinedBehaviorSanitizer运行相同的 97 项测试，未报告错误，原始日志为test-results/sanitize-020.log。</w:t>
+              <w:t xml:space="preserve">业务源码以-Wall -Wextra -Wpedantic -Werror编译通过。make sanitize对同一组 97 项用例启用AddressSanitizer与UndefinedBehaviorSanitizer，检查通过。C++编码规范由cpplint检查，C++与Objective-C++排版由clang-format检查。</w:t>
             </w:r>
           </w:p>
           <w:p>
@@ -12914,7 +12914,7 @@
                 <w:szCs w:val="22"/>
                 <w:color w:val="000000"/>
               </w:rPr>
-              <w:t xml:space="preserve">这两类工具不覆盖所有数据竞争、系统资源泄漏和断电场景。工具未覆盖的情形继续保留为验证边界。</w:t>
+              <w:t xml:space="preserve">信号中断测试通过20项，记录见test-results/signals-020.json。明文与加密的备份、恢复、验证、查看操作接收SIGINT或SIGTERM后返回130并清理暂存；自动任务停止后保留已完成快照。</w:t>
             </w:r>
           </w:p>
           <w:p>
@@ -12934,67 +12934,7 @@
                 <w:szCs w:val="22"/>
                 <w:color w:val="000000"/>
               </w:rPr>
-              <w:t xml:space="preserve">操作系统信号补充测试通过20/20种组合：向正在读写的明文／加密backup、restore、verify、list进程发送SIGINT或SIGTERM，单次操作均返回130且清理暂存；定时与watch任务在下一份备份进行中停止，返回0并保留前一份可验证快照。源文件和原归档哈希未变。证据为signals-020.json，独立于核心命名用例统计。</w:t>
-            </w:r>
-          </w:p>
-          <w:p>
-            <w:pPr>
-              <w:spacing w:line="360" w:lineRule="auto"/>
-              <w:ind w:firstLine="420" w:firstLineChars="200"/>
-              <w:rPr>
-                <w:rFonts w:ascii="Calibri" w:hAnsi="Calibri"/>
-                <w:szCs w:val="22"/>
-              </w:rPr>
-              <w:widowControl w:val="1"/>
-              <w:snapToGrid w:val="0"/>
-            </w:pPr>
-            <w:r>
-              <w:rPr>
-                <w:rFonts w:hint="eastAsia" w:ascii="Calibri" w:hAnsi="Calibri"/>
-                <w:szCs w:val="22"/>
-                <w:color w:val="000000"/>
-              </w:rPr>
-              <w:t xml:space="preserve">cpplint 2.0.2检查结果：通过。范围为Makefile列出的C++头文件、业务源码与测试，未包含Objective-C++；原始日志见lint-020.log。</w:t>
-            </w:r>
-          </w:p>
-          <w:p>
-            <w:pPr>
-              <w:spacing w:line="360" w:lineRule="auto"/>
-              <w:ind w:firstLine="420" w:firstLineChars="200"/>
-              <w:rPr>
-                <w:rFonts w:ascii="Calibri" w:hAnsi="Calibri"/>
-                <w:szCs w:val="22"/>
-              </w:rPr>
-              <w:widowControl w:val="1"/>
-              <w:snapToGrid w:val="0"/>
-            </w:pPr>
-            <w:r>
-              <w:rPr>
-                <w:rFonts w:hint="eastAsia" w:ascii="Calibri" w:hAnsi="Calibri"/>
-                <w:szCs w:val="22"/>
-                <w:color w:val="000000"/>
-              </w:rPr>
-              <w:t xml:space="preserve">Huffman随机输入测试运行60.0秒、32353次，结果通过，固定种子20261029。它是随机输入驱动，并非覆盖率引导的libFuzzer；使用ASan/UBSan，次数不计入命名用例总数。证据为fuzz.json及fuzz.log。</w:t>
-            </w:r>
-          </w:p>
-          <w:p>
-            <w:pPr>
-              <w:spacing w:line="360" w:lineRule="auto"/>
-              <w:ind w:firstLine="420" w:firstLineChars="200"/>
-              <w:rPr>
-                <w:rFonts w:ascii="Calibri" w:hAnsi="Calibri"/>
-                <w:szCs w:val="22"/>
-              </w:rPr>
-              <w:widowControl w:val="1"/>
-              <w:snapToGrid w:val="0"/>
-            </w:pPr>
-            <w:r>
-              <w:rPr>
-                <w:rFonts w:hint="eastAsia" w:ascii="Calibri" w:hAnsi="Calibri"/>
-                <w:szCs w:val="22"/>
-                <w:color w:val="000000"/>
-              </w:rPr>
-              <w:t xml:space="preserve">归档解析器使用LLVM libFuzzer 14.0.6进行覆盖率引导测试，运行602.286秒、119,844次，通过。进程正常退出，没有崩溃工件或ASan/UBSan错误标记。归档与Huffman相关源码哈希与本次源码一致。测试使用空恢复目标，范围为SQTREE解析与Huffman解码，不含文件写入、加密封装和GUI。执行次数不并入97项用例，也不代表覆盖百分比。复现方法见test-results/archive-fuzz-020.md，原始JSON和日志同名保存。</w:t>
+              <w:t xml:space="preserve">写入故障与强制终止测试通过24项，记录见test-results/fault-injection-020.json。通过注入ENOSPC、EINTR、短写入及发布失败检查错误处理，并在实际读写中发送SIGKILL。异常操作不覆盖已有结果，正常重试成功；强制终止后可能保留私有暂存目录。</w:t>
             </w:r>
           </w:p>
           <w:p>
@@ -13010,7 +12950,7 @@
                 <w:lang w:bidi="ar"/>
               </w:rPr>
               <w:keepNext/>
-              <w:spacing w:before="1300"/>
+              <w:spacing w:before="240"/>
               <w:snapToGrid w:val="0"/>
             </w:pPr>
             <w:r>
@@ -13043,7 +12983,7 @@
                 <w:szCs w:val="22"/>
                 <w:color w:val="000000"/>
               </w:rPr>
-              <w:t xml:space="preserve">单次本地测量如下。备份和恢复时间包含CLI进程开销，测量期间存在其它后台任务，文件系统缓存也可能影响结果；不据此给出稳定吞吐率承诺。</w:t>
+              <w:t xml:space="preserve">在本机各执行一次备份和恢复，结果如下。耗时包含进程启动，受文件系统缓存和后台负载影响。</w:t>
             </w:r>
           </w:p>
           <w:tbl>
@@ -13378,7 +13318,7 @@
                       <w:szCs w:val="22"/>
                       <w:color w:val="000000"/>
                     </w:rPr>
-                    <w:t xml:space="preserve">33356</w:t>
+                    <w:t xml:space="preserve">33278</w:t>
                   </w:r>
                 </w:p>
               </w:tc>
@@ -13409,7 +13349,7 @@
                       <w:szCs w:val="22"/>
                       <w:color w:val="000000"/>
                     </w:rPr>
-                    <w:t xml:space="preserve">0.9400</w:t>
+                    <w:t xml:space="preserve">0.2804</w:t>
                   </w:r>
                 </w:p>
               </w:tc>
@@ -13440,7 +13380,7 @@
                       <w:szCs w:val="22"/>
                       <w:color w:val="000000"/>
                     </w:rPr>
-                    <w:t xml:space="preserve">0.0194</w:t>
+                    <w:t xml:space="preserve">0.0210</w:t>
                   </w:r>
                 </w:p>
               </w:tc>
@@ -13569,7 +13509,7 @@
                       <w:szCs w:val="22"/>
                       <w:color w:val="000000"/>
                     </w:rPr>
-                    <w:t xml:space="preserve">8388980</w:t>
+                    <w:t xml:space="preserve">8388902</w:t>
                   </w:r>
                 </w:p>
               </w:tc>
@@ -13600,7 +13540,7 @@
                       <w:szCs w:val="22"/>
                       <w:color w:val="000000"/>
                     </w:rPr>
-                    <w:t xml:space="preserve">0.2021</w:t>
+                    <w:t xml:space="preserve">0.1852</w:t>
                   </w:r>
                 </w:p>
               </w:tc>
@@ -13631,7 +13571,7 @@
                       <w:szCs w:val="22"/>
                       <w:color w:val="000000"/>
                     </w:rPr>
-                    <w:t xml:space="preserve">0.0466</w:t>
+                    <w:t xml:space="preserve">0.0484</w:t>
                   </w:r>
                 </w:p>
               </w:tc>
@@ -13705,7 +13645,7 @@
                 <w:szCs w:val="22"/>
                 <w:color w:val="000000"/>
               </w:rPr>
-              <w:t xml:space="preserve">重复单字节数据主要覆盖Huffman单符号分支；随机数据主要验证压缩无收益时回退原始块。这里没有测峰值RSS，格式中的1TiB单文件上限也不等于已完成该容量实测。</w:t>
+              <w:t xml:space="preserve">重复数据检查Huffman单符号压缩，随机数据检查压缩收益不足时保存原始块。</w:t>
             </w:r>
           </w:p>
           <w:p>
@@ -13725,27 +13665,7 @@
                 <w:szCs w:val="22"/>
                 <w:color w:val="000000"/>
               </w:rPr>
-              <w:t xml:space="preserve">0.1.0与0.2.0之间的双向恢复已检查明文和加密共4种组合，均通过内容与链接关系比对。测试时间2026年10月29日 11:36（北京时间），见compatibility-020.json。这些兼容性场景单独列出，不并入核心命名用例总数。</w:t>
-            </w:r>
-          </w:p>
-          <w:p>
-            <w:pPr>
-              <w:spacing w:line="360" w:lineRule="auto"/>
-              <w:ind w:firstLine="420" w:firstLineChars="200"/>
-              <w:rPr>
-                <w:rFonts w:ascii="Calibri" w:hAnsi="Calibri"/>
-                <w:szCs w:val="22"/>
-              </w:rPr>
-              <w:widowControl w:val="1"/>
-              <w:snapToGrid w:val="0"/>
-            </w:pPr>
-            <w:r>
-              <w:rPr>
-                <w:rFonts w:hint="eastAsia" w:ascii="Calibri" w:hAnsi="Calibri"/>
-                <w:szCs w:val="22"/>
-                <w:color w:val="000000"/>
-              </w:rPr>
-              <w:t xml:space="preserve">写入故障与强制终止另行补测24种场景，通过24种。明文和加密分别检查打包、封装、解码、恢复写入返回ENOSPC，刷写或发布失败，权限恢复失败，以及EINTR和短写入。失败场景没有发布目标，已保存备份保持不变，同名目标重试成功。4种实际SIGKILL场景在观察到至少4MiB写入后强制结束，私有暂存根目录以0700权限遗留，正常重试不删除旧暂存。详细范围、源码和原始记录见test-results/fault-injection-020.md及对应JSON；没有实际占满磁盘或断电，不并入97项核心用例。</w:t>
+              <w:t xml:space="preserve">0.1.0与当前0.2.0进行了明文、加密的双向兼容测试，共4种组合，恢复内容与链接关系均符合预期，记录见test-results/compatibility-020.json。</w:t>
             </w:r>
           </w:p>
           <w:p>
@@ -13773,7 +13693,7 @@
                 <w:szCs w:val="28"/>
                 <w:lang w:bidi="ar"/>
               </w:rPr>
-              <w:t xml:space="preserve">6 持续运行测试</w:t>
+              <w:t xml:space="preserve">6 测试结论</w:t>
             </w:r>
           </w:p>
           <w:p>
@@ -13793,7 +13713,7 @@
                 <w:szCs w:val="22"/>
                 <w:color w:val="000000"/>
               </w:rPr>
-              <w:t xml:space="preserve">第一次持续运行在52次正常检查后中断，最后记录时长为4.34小时。核对时原进程已不存在，退出原因尚未确定。该次不认定20小时通过，也不与后续运行时长相加；观察记录见soak-interrupted-20261029.json。</w:t>
+              <w:t xml:space="preserve">97项核心测试及GUI、信号和故障注入检查通过。测试覆盖了正常往返、输入错误、归档损坏、取消和自动任务。验证环境为本机磁盘；结果按各项输入、操作与断言记录。</w:t>
             </w:r>
           </w:p>
           <w:p>
@@ -13813,115 +13733,7 @@
                 <w:szCs w:val="22"/>
                 <w:color w:val="000000"/>
               </w:rPr>
-              <w:t xml:space="preserve">后一次定时与加密watch联合观察从2026年10月29日15:22开始，最后有效检查覆盖5.76小时，共69次，记录中无错误。此后取消连续20小时测试安排，核对时进程已经结束，未再重启；不能据此认定20小时通过。课程材料没有连续20小时测试要求，本次保留观察记录，不再作为交付前置条件。原始记录及取消说明见soak-observation-20261029.raw.json与soak-cancelled-20261029.json。</w:t>
-            </w:r>
-          </w:p>
-          <w:p>
-            <w:pPr>
-              <w:spacing w:line="360" w:lineRule="auto"/>
-              <w:ind w:firstLine="420" w:firstLineChars="200"/>
-              <w:rPr>
-                <w:rFonts w:ascii="Calibri" w:hAnsi="Calibri"/>
-                <w:szCs w:val="22"/>
-              </w:rPr>
-              <w:widowControl w:val="1"/>
-              <w:snapToGrid w:val="0"/>
-            </w:pPr>
-            <w:r>
-              <w:rPr>
-                <w:rFonts w:hint="eastAsia" w:ascii="Calibri" w:hAnsi="Calibri"/>
-                <w:szCs w:val="22"/>
-                <w:color w:val="000000"/>
-              </w:rPr>
-              <w:t xml:space="preserve">观察使用冻结CLI，二进制对应关系见lint-rebuild-comparison.json。</w:t>
-            </w:r>
-          </w:p>
-          <w:p>
-            <w:pPr>
-              <w:widowControl w:val="1"/>
-              <w:jc w:val="left"/>
-              <w:rPr>
-                <w:rFonts w:ascii="宋体" w:hAnsi="宋体" w:cs="宋体"/>
-                <w:b/>
-                <w:color w:val="000000"/>
-                <w:kern w:val="0"/>
-                <w:sz w:val="24"/>
-                <w:lang w:bidi="ar"/>
-              </w:rPr>
-              <w:keepNext/>
-              <w:snapToGrid w:val="0"/>
-            </w:pPr>
-            <w:r>
-              <w:rPr>
-                <w:rFonts w:hint="eastAsia" w:ascii="宋体" w:hAnsi="宋体" w:cs="宋体"/>
-                <w:b/>
-                <w:color w:val="000000"/>
-                <w:kern w:val="0"/>
-                <w:sz w:val="28"/>
-                <w:szCs w:val="28"/>
-                <w:lang w:bidi="ar"/>
-              </w:rPr>
-              <w:t xml:space="preserve">7 结论和验收边界</w:t>
-            </w:r>
-          </w:p>
-          <w:p>
-            <w:pPr>
-              <w:spacing w:line="360" w:lineRule="auto"/>
-              <w:ind w:firstLine="420" w:firstLineChars="200"/>
-              <w:rPr>
-                <w:rFonts w:ascii="Calibri" w:hAnsi="Calibri"/>
-                <w:szCs w:val="22"/>
-              </w:rPr>
-              <w:widowControl w:val="1"/>
-              <w:snapToGrid w:val="0"/>
-            </w:pPr>
-            <w:r>
-              <w:rPr>
-                <w:rFonts w:hint="eastAsia" w:ascii="Calibri" w:hAnsi="Calibri"/>
-                <w:szCs w:val="22"/>
-                <w:color w:val="000000"/>
-              </w:rPr>
-              <w:t xml:space="preserve">已覆盖的备份、验证、恢复、取消和自动任务路径均满足对应断言。发布前复查能发现已测的源树变化，但不能提供多文件事务一致性；应用不支持网络备份、增量备份、系统守护和重启后自动续跑。</w:t>
-            </w:r>
-          </w:p>
-          <w:p>
-            <w:pPr>
-              <w:spacing w:line="360" w:lineRule="auto"/>
-              <w:ind w:firstLine="420" w:firstLineChars="200"/>
-              <w:rPr>
-                <w:rFonts w:ascii="Calibri" w:hAnsi="Calibri"/>
-                <w:szCs w:val="22"/>
-              </w:rPr>
-              <w:widowControl w:val="1"/>
-              <w:snapToGrid w:val="0"/>
-            </w:pPr>
-            <w:r>
-              <w:rPr>
-                <w:rFonts w:hint="eastAsia" w:ascii="Calibri" w:hAnsi="Calibri"/>
-                <w:szCs w:val="22"/>
-                <w:color w:val="000000"/>
-              </w:rPr>
-              <w:t xml:space="preserve">本轮未覆盖跨机器运行、外置卷和网络卷、真实磁盘耗尽、掉电持久性、异属主恢复、ACL与文件flags。强制终止只验证了补测中列出的时机和输入；未实现的功能不作为本轮通过项。</w:t>
-            </w:r>
-          </w:p>
-          <w:p>
-            <w:pPr>
-              <w:spacing w:line="360" w:lineRule="auto"/>
-              <w:ind w:firstLine="420" w:firstLineChars="200"/>
-              <w:rPr>
-                <w:rFonts w:ascii="Calibri" w:hAnsi="Calibri"/>
-                <w:szCs w:val="22"/>
-              </w:rPr>
-              <w:widowControl w:val="1"/>
-              <w:snapToGrid w:val="0"/>
-            </w:pPr>
-            <w:r>
-              <w:rPr>
-                <w:rFonts w:hint="eastAsia" w:ascii="Calibri" w:hAnsi="Calibri"/>
-                <w:szCs w:val="22"/>
-                <w:color w:val="000000"/>
-              </w:rPr>
-              <w:t xml:space="preserve">复现命令见README：make test、make sanitize及tests/benchmark.py。GUI自测使用--self-test，长测脚本为tests/soak.py；两者均使用新的测试目录，不使用工作数据。</w:t>
+              <w:t xml:space="preserve">复现命令为make test、make sanitize及README中列出的GUI自测命令。性能、兼容性、信号和故障注入脚本位于tests目录，测试数据在独立临时目录内创建。</w:t>
             </w:r>
           </w:p>
         </w:tc>
@@ -14028,7 +13840,7 @@
                 <w:szCs w:val="22"/>
                 <w:color w:val="000000"/>
               </w:rPr>
-              <w:t xml:space="preserve">只读目录恢复曾暴露权限设置顺序问题；停止操作则需要检查任务是否响应，以及失败后是否残留半成品。相关处理均保留代码差异和测试记录，不能仅凭工具给出的解释判断正确。</w:t>
+              <w:t xml:space="preserve">只读目录恢复需要先建立子项再设置目录权限；取消操作需要检查响应时机和暂存清理。针对这两类问题，工具帮助定位了调用路径，修改效果通过回归测试和界面操作核对。</w:t>
             </w:r>
           </w:p>
           <w:p>
@@ -14133,7 +13945,7 @@
                 <w:szCs w:val="22"/>
                 <w:color w:val="000000"/>
               </w:rPr>
-              <w:t xml:space="preserve">97项命名自动测试和Sanitizer复测通过，另完成53项GUI内部断言及12项桌面验收。定时与变化检测的持续观察保留实际检查记录；没有完成连续20小时运行，不作该时长的通过结论。</w:t>
+              <w:t xml:space="preserve">97 项自动测试通过，另完成 53 项 GUI 内部断言及 12 项桌面验收。备份与恢复内容、特殊文件关系、元数据、错误处理和自动任务均有对应检查记录。</w:t>
             </w:r>
           </w:p>
         </w:tc>
@@ -14427,7 +14239,7 @@
                 <w:szCs w:val="22"/>
                 <w:color w:val="000000"/>
               </w:rPr>
-              <w:t xml:space="preserve">跨平台实验可按能力选择工具，例如macOS上的Sanitizer与系统调试器。本机验收同时检查程序、模型和放映效果；三位成员分别解释主责模块，并能交叉说明备份与恢复的完整过程。</w:t>
+              <w:t xml:space="preserve">实验工具可结合操作系统选择，例如在 macOS 上使用 Sanitizer 和系统调试器。验收时同时核对界面结果和实际文件，排练时由各成员讲解主责模块，并交叉说明备份与恢复流程。</w:t>
             </w:r>
           </w:p>
         </w:tc>

</xml_diff>